<commit_message>
Correct required truss to equilateral triangle with 1 m sides
</commit_message>
<xml_diff>
--- a/生成交付文件/计算结构力学大作业/计算报告.docx
+++ b/生成交付文件/计算结构力学大作业/计算报告.docx
@@ -863,7 +863,7 @@
     </w:p>
     <w:p>
       <w:r>
-        <w:t>必做题的连接关系、支座条件、荷载、材料及截面取自用户上传仓库 xiaoxiaoshengwu/structure-work 中的“必做题_总控信息.txt”。本次使用提交 e6b174236a374e92f8f06a51fcc683aec7623158 的文件。根据用户确认，数值计算直接采用总控信息中的 l=h=1 m；原题示意图未给定数值尺寸，故这两个值属于本报告的补充计算假定。为便于替换尺寸，第3章同时给出一般 l、h 的解析表达式。</w:t>
+        <w:t>必做题按边长为1 m的等边三角形计算。节点1、2、4构成等边外轮廓，底边l=1 m，顶点高度h=√3/2 m。连接关系、支座条件、荷载及材料截面沿用用户上传仓库xiaoxiaoshengwu/structure-work；本次依据用户澄清修正原总控文件的顶点坐标，并同步重算位移、杆力和支反力。第3章同时保留一般尺寸参数的刚度表达式，再代入等边三角形的几何关系。</w:t>
       </w:r>
     </w:p>
     <w:p>
@@ -3819,7 +3819,7 @@
       <w:r>
         <w:drawing>
           <wp:inline xmlns:a="http://schemas.openxmlformats.org/drawingml/2006/main" xmlns:pic="http://schemas.openxmlformats.org/drawingml/2006/picture">
-            <wp:extent cx="4572000" cy="4255477"/>
+            <wp:extent cx="4572000" cy="3835092"/>
             <wp:docPr id="1" name="Picture 1"/>
             <wp:cNvGraphicFramePr>
               <a:graphicFrameLocks noChangeAspect="1"/>
@@ -3840,7 +3840,7 @@
                   <pic:spPr>
                     <a:xfrm>
                       <a:off x="0" y="0"/>
-                      <a:ext cx="4572000" cy="4255477"/>
+                      <a:ext cx="4572000" cy="3835092"/>
                     </a:xfrm>
                     <a:prstGeom prst="rect"/>
                   </pic:spPr>
@@ -4682,7 +4682,7 @@
                 <w:b w:val="0"/>
                 <w:sz w:val="21"/>
               </w:rPr>
-              <w:t>1</w:t>
+              <w:t>0.8660254038</w:t>
             </w:r>
           </w:p>
         </w:tc>
@@ -4965,7 +4965,7 @@
     </w:p>
     <w:p>
       <w:r>
-        <w:t>原图内侧两杆与底边夹角为30°，故节点3高度 b=l/(2√3)。节点4高度 h 独立输入，不能由图像比例推定。采用已确认的 l=h=1 m 时，竖杆长度 h−b=0.7113248654 m。</w:t>
+        <w:t>内侧两杆与底边夹角为30°，故节点3高度b=l/(2√3)=√3/6 m。外轮廓为边长1 m的等边三角形，节点4高度h=√3/2=0.8660254038 m，两外侧杆与底边夹角均为60°。因此杆①③⑥长度均为1 m，杆②④⑤长度均为1/√3=0.5773502692 m。</w:t>
       </w:r>
     </w:p>
     <w:p>
@@ -4980,7 +4980,7 @@
     </w:p>
     <w:p>
       <w:r>
-        <w:t>为保留尺寸的一般性，先定义 a=l/2、b=l/(2√3)、d=h−b、Lo=√(a²+h²)，并要求l&gt;0、h&gt;b。外侧杆①③的方向余弦绝对值为c=a/Lo、s=h/Lo；内側杆④⑤的长度Li=l/√3，方向余弦绝对值为√3/2、1/2。</w:t>
+        <w:t>为保留尺寸的一般性，先定义 a=l/2、b=l/(2√3)、d=h−b、Lo=√(a²+h²)，并要求l&gt;0、h&gt;b；本题进一步有h=√3l/2。外侧杆①③的方向余弦绝对值为c=a/Lo、s=h/Lo；内側杆④⑤的长度Li=l/√3，方向余弦绝对值为√3/2、1/2。</w:t>
       </w:r>
     </w:p>
     <w:p>
@@ -5689,7 +5689,7 @@
     </w:p>
     <w:p>
       <w:r>
-        <w:t>代入l=h=1 m，得到ko=4.2932505168×10⁶、ki=8.3138438763×10⁶、kv=6.7479716139×10⁶ kN/m。数值缩减刚度矩阵如下，整体量纲为kN/m：</w:t>
+        <w:t>代入l=1 m、h=√3/2 m，外侧杆方向余弦绝对值为c=1/2、s=√3/2；得到ko=4.8×10⁶、ki=kv=8.3138438763×10⁶ kN/m。数值缩减刚度矩阵如下，整体量纲为kN/m：</w:t>
       </w:r>
     </w:p>
     <w:p>
@@ -5811,7 +5811,7 @@
                 </m:e>
                 <m:e>
                   <m:r>
-                    <m:t>10.9048935520</m:t>
+                    <m:t>12.4707658145</m:t>
                   </m:r>
                 </m:e>
                 <m:e>
@@ -5827,7 +5827,7 @@
                     <m:t>−</m:t>
                   </m:r>
                   <m:r>
-                    <m:t>6.7479716139</m:t>
+                    <m:t>8.3138438763</m:t>
                   </m:r>
                 </m:e>
               </m:mr>
@@ -5844,7 +5844,7 @@
                 </m:e>
                 <m:e>
                   <m:r>
-                    <m:t>1.7173002067</m:t>
+                    <m:t>2.4000000000</m:t>
                   </m:r>
                 </m:e>
                 <m:e>
@@ -5867,7 +5867,7 @@
                     <m:t>−</m:t>
                   </m:r>
                   <m:r>
-                    <m:t>6.7479716139</m:t>
+                    <m:t>8.3138438763</m:t>
                   </m:r>
                 </m:e>
                 <m:e>
@@ -5877,7 +5877,7 @@
                 </m:e>
                 <m:e>
                   <m:r>
-                    <m:t>13.6171724408</m:t>
+                    <m:t>15.5138438763</m:t>
                   </m:r>
                 </m:e>
               </m:mr>
@@ -6470,7 +6470,7 @@
               </m:dPr>
               <m:e>
                 <m:r>
-                  <m:t>0</m:t>
+                  <m:t>0.0000000000</m:t>
                 </m:r>
                 <m:r>
                   <m:rPr>
@@ -6485,7 +6485,7 @@
                   <m:t>−</m:t>
                 </m:r>
                 <m:r>
-                  <m:t>4.6344181862</m:t>
+                  <m:t>4.7276223284</m:t>
                 </m:r>
                 <m:r>
                   <m:rPr>
@@ -6494,7 +6494,7 @@
                   <m:t>,</m:t>
                 </m:r>
                 <m:r>
-                  <m:t>52.8216777496</m:t>
+                  <m:t>37.7961158828</m:t>
                 </m:r>
                 <m:r>
                   <m:rPr>
@@ -6509,7 +6509,7 @@
                   <m:t>−</m:t>
                 </m:r>
                 <m:r>
-                  <m:t>7.4893375207</m:t>
+                  <m:t>7.0914334926</m:t>
                 </m:r>
               </m:e>
             </m:d>
@@ -7028,7 +7028,7 @@
     </w:p>
     <w:p>
       <w:r>
-        <w:t>代入手算位移得到N1=+72.6585651998 kN、N2=−19.2649146289 kN、N3=−130.1766773586 kN、N4=N5=−19.2649146289 kN、N6=0。底杆⑥两端均无位移，不发生轴向变形，不能遗漏该杆，但其轴力确为零。</w:t>
+        <w:t>代入手算位移得到N1=+61.2321426604 kN、N2=-19.6523569722 kN、N3=-120.1892135769 kN、N4=N5=-19.6523569722 kN、N6=0。底杆⑥两端均无位移，不发生轴向变形，不能遗漏该杆，但其轴力确为零。</w:t>
       </w:r>
     </w:p>
     <w:p>
@@ -7616,7 +7616,7 @@
                 <w:b w:val="0"/>
                 <w:sz w:val="21"/>
               </w:rPr>
-              <w:t>−15.8099927165</w:t>
+              <w:t>-13.5966309480</w:t>
             </w:r>
           </w:p>
         </w:tc>
@@ -7644,7 +7644,7 @@
                 <w:b w:val="0"/>
                 <w:sz w:val="21"/>
               </w:rPr>
-              <w:t>−55.3553390593</w:t>
+              <w:t>-43.2024125859</w:t>
             </w:r>
           </w:p>
         </w:tc>
@@ -7707,7 +7707,7 @@
                 <w:b w:val="0"/>
                 <w:sz w:val="21"/>
               </w:rPr>
-              <w:t>−74.9006854021</w:t>
+              <w:t>-77.1140471706</w:t>
             </w:r>
           </w:p>
         </w:tc>
@@ -7736,7 +7736,7 @@
                 <w:b w:val="0"/>
                 <w:sz w:val="21"/>
               </w:rPr>
-              <w:t>+126.0660171780</w:t>
+              <w:t>+113.9130907046</w:t>
             </w:r>
           </w:p>
         </w:tc>
@@ -7747,7 +7747,7 @@
     </w:p>
     <w:p>
       <w:r>
-        <w:t>竖向反力R1y为负表示左支座向下作用，此处支座被建模为可承受双向反力的约束，未引入脱离或单向接触。整体力矩核对：R2y−70.7106781187×0.5−90.7106781187×1=0。</w:t>
+        <w:t>竖向反力R1y为负表示左支座向下作用，此处支座被建模为可承受双向反力的约束，未引入脱离或单向接触。整体力矩核对：R2y−70.7106781187×0.5−90.7106781187×(√3/2)=0。</w:t>
       </w:r>
     </w:p>
     <w:p>
@@ -8080,7 +8080,7 @@
                 <w:b w:val="0"/>
                 <w:sz w:val="21"/>
               </w:rPr>
-              <w:t>-0.0046344182</w:t>
+              <w:t>-0.0047276223</w:t>
             </w:r>
           </w:p>
         </w:tc>
@@ -8108,7 +8108,7 @@
                 <w:b w:val="0"/>
                 <w:sz w:val="21"/>
               </w:rPr>
-              <w:t>-0.0046344182</w:t>
+              <w:t>-0.0047276223</w:t>
             </w:r>
           </w:p>
         </w:tc>
@@ -8197,7 +8197,7 @@
                 <w:b w:val="0"/>
                 <w:sz w:val="21"/>
               </w:rPr>
-              <w:t>0.0528216777</w:t>
+              <w:t>0.0377961159</w:t>
             </w:r>
           </w:p>
         </w:tc>
@@ -8225,7 +8225,7 @@
                 <w:b w:val="0"/>
                 <w:sz w:val="21"/>
               </w:rPr>
-              <w:t>0.0528216777</w:t>
+              <w:t>0.0377961159</w:t>
             </w:r>
           </w:p>
         </w:tc>
@@ -8316,7 +8316,7 @@
                 <w:b w:val="0"/>
                 <w:sz w:val="21"/>
               </w:rPr>
-              <w:t>-0.0074893375</w:t>
+              <w:t>-0.0070914335</w:t>
             </w:r>
           </w:p>
         </w:tc>
@@ -8345,7 +8345,7 @@
                 <w:b w:val="0"/>
                 <w:sz w:val="21"/>
               </w:rPr>
-              <w:t>-0.0074893375</w:t>
+              <w:t>-0.0070914335</w:t>
             </w:r>
           </w:p>
         </w:tc>
@@ -8643,7 +8643,7 @@
                 <w:b w:val="0"/>
                 <w:sz w:val="21"/>
               </w:rPr>
-              <w:t>72.658565200</w:t>
+              <w:t>61.232142660</w:t>
             </w:r>
           </w:p>
         </w:tc>
@@ -8671,7 +8671,7 @@
                 <w:b w:val="0"/>
                 <w:sz w:val="21"/>
               </w:rPr>
-              <w:t>72.658565200</w:t>
+              <w:t>61.232142660</w:t>
             </w:r>
           </w:p>
         </w:tc>
@@ -8788,7 +8788,7 @@
                 <w:b w:val="0"/>
                 <w:sz w:val="21"/>
               </w:rPr>
-              <w:t>-19.264914629</w:t>
+              <w:t>-19.652356972</w:t>
             </w:r>
           </w:p>
         </w:tc>
@@ -8816,7 +8816,7 @@
                 <w:b w:val="0"/>
                 <w:sz w:val="21"/>
               </w:rPr>
-              <w:t>-19.264914629</w:t>
+              <w:t>-19.652356972</w:t>
             </w:r>
           </w:p>
         </w:tc>
@@ -8933,7 +8933,7 @@
                 <w:b w:val="0"/>
                 <w:sz w:val="21"/>
               </w:rPr>
-              <w:t>-130.176677359</w:t>
+              <w:t>-120.189213577</w:t>
             </w:r>
           </w:p>
         </w:tc>
@@ -8961,7 +8961,7 @@
                 <w:b w:val="0"/>
                 <w:sz w:val="21"/>
               </w:rPr>
-              <w:t>-130.176677359</w:t>
+              <w:t>-120.189213577</w:t>
             </w:r>
           </w:p>
         </w:tc>
@@ -9078,7 +9078,7 @@
                 <w:b w:val="0"/>
                 <w:sz w:val="21"/>
               </w:rPr>
-              <w:t>-19.264914629</w:t>
+              <w:t>-19.652356972</w:t>
             </w:r>
           </w:p>
         </w:tc>
@@ -9106,7 +9106,7 @@
                 <w:b w:val="0"/>
                 <w:sz w:val="21"/>
               </w:rPr>
-              <w:t>-19.264914629</w:t>
+              <w:t>-19.652356972</w:t>
             </w:r>
           </w:p>
         </w:tc>
@@ -9223,7 +9223,7 @@
                 <w:b w:val="0"/>
                 <w:sz w:val="21"/>
               </w:rPr>
-              <w:t>-19.264914629</w:t>
+              <w:t>-19.652356972</w:t>
             </w:r>
           </w:p>
         </w:tc>
@@ -9251,7 +9251,7 @@
                 <w:b w:val="0"/>
                 <w:sz w:val="21"/>
               </w:rPr>
-              <w:t>-19.264914629</w:t>
+              <w:t>-19.652356972</w:t>
             </w:r>
           </w:p>
         </w:tc>
@@ -9440,7 +9440,7 @@
     </w:p>
     <w:p>
       <w:r>
-        <w:t>本次程序的自由方程最大残差为1.4211×10⁻¹⁴ kN，整体水平合力为0，竖向合力及合矩均约1.4211×10⁻¹⁴。应变能U=2.6605331714×10⁻³ kN·m，2U与最终力-位移乘积一致。上表差值按未舍入数据计算；个位数尾差来自浮点计算和结果文件的输出精度。</w:t>
+        <w:t>本次程序的自由方程最大残差为1.4211×10⁻¹⁴ kN；整体水平合力、竖向合力及合矩误差均小于10⁻¹²。应变能U=0.00196497568654 kN·m，2U与最终力-位移乘积一致。上表差值按未舍入数据计算；个位数尾差来自浮点计算和结果文件的输出精度。</w:t>
       </w:r>
     </w:p>
     <w:p>
@@ -19267,7 +19267,7 @@
     </w:p>
     <w:p>
       <w:r>
-        <w:t>必做题节点4水平位移最大，为+0.0528216777 mm；两自由节点竖向均向下。最大拉力出现在杆①，为72.6585651998 kN；最大压力绝对值出现在杆③，为130.1766773586 kN；底杆⑥轴力为零。</w:t>
+        <w:t>必做题节点4水平位移最大，为+0.0377961159 mm；两自由节点竖向均向下。最大拉力出现在杆①，为61.2321426604 kN；最大压力绝对值出现在杆③，为120.1892135769 kN；底杆⑥轴力为零。</w:t>
       </w:r>
     </w:p>
     <w:p>
@@ -21850,7 +21850,7 @@
           <w:b w:val="0"/>
           <w:sz w:val="24"/>
         </w:rPr>
-        <w:t xml:space="preserve"> * 图中没有指定 l、h 数值；输入值均为用户参数，不能当作题图已知尺寸。 */</w:t>
+        <w:t xml:space="preserve"> * 本次必做题外轮廓为边长1 m的等边三角形，取l=1、h=sqrt(3)/2。 */</w:t>
       </w:r>
     </w:p>
     <w:p>
@@ -25401,7 +25401,7 @@
           <w:b w:val="0"/>
           <w:sz w:val="24"/>
         </w:rPr>
-        <w:t># Mandatory six-bar truss. Units: m, kN.</w:t>
+        <w:t># Mandatory problem: outer equilateral triangle with side length 1 m.</w:t>
       </w:r>
     </w:p>
     <w:p>
@@ -25416,7 +25416,7 @@
           <w:b w:val="0"/>
           <w:sz w:val="24"/>
         </w:rPr>
-        <w:t># Supplemental report assumption: l=1 m, h=1 m; original diagram has no dimensions.</w:t>
+        <w:t># l=1 m, h=sqrt(3)/2 m. Inner bars make 30 degrees with base.</w:t>
       </w:r>
     </w:p>
     <w:p>
@@ -25431,7 +25431,7 @@
           <w:b w:val="0"/>
           <w:sz w:val="24"/>
         </w:rPr>
-        <w:t># E=2e7 kN/m^2; A=0.24 m^2; tension positive.</w:t>
+        <w:t># Units: m, kN; E=2e7 kN/m^2; A=0.24 m^2; tension positive.</w:t>
       </w:r>
     </w:p>
     <w:p>
@@ -25536,7 +25536,7 @@
           <w:b w:val="0"/>
           <w:sz w:val="24"/>
         </w:rPr>
-        <w:t>4 0.5 1 0 0 0 0 90.710678118654741 -70.710678118654741</w:t>
+        <w:t>4 0.5 0.8660254037844386 0 0 0 0 90.710678118654741 -70.710678118654741</w:t>
       </w:r>
     </w:p>
     <w:p>

</xml_diff>